<commit_message>
docs: update team names, student IDs and member reports
</commit_message>
<xml_diff>
--- a/01-提交文档/00-提交封面.docx
+++ b/01-提交文档/00-提交封面.docx
@@ -129,7 +129,7 @@
           <w:sz w:val="32"/>
           <w:szCs w:val="32"/>
         </w:rPr>
-        <w:t>小组成员表（组长：teammate0）：</w:t>
+        <w:t>小组成员表（组长：陈辰）：</w:t>
       </w:r>
     </w:p>
     <w:tbl>
@@ -365,7 +365,7 @@
               </w:rPr>
             </w:pPr>
             <w:r>
-              <w:t>待填写</w:t>
+              <w:t>25230426</w:t>
               <w:rPr>
                 <w:sz w:val="24"/>
               </w:rPr>
@@ -386,7 +386,7 @@
               </w:rPr>
             </w:pPr>
             <w:r>
-              <w:t>teammate0</w:t>
+              <w:t>陈辰</w:t>
               <w:rPr>
                 <w:sz w:val="24"/>
               </w:rPr>
@@ -478,7 +478,7 @@
               </w:rPr>
             </w:pPr>
             <w:r>
-              <w:t>待填写</w:t>
+              <w:t>87220604</w:t>
               <w:rPr>
                 <w:sz w:val="24"/>
               </w:rPr>
@@ -499,7 +499,7 @@
               </w:rPr>
             </w:pPr>
             <w:r>
-              <w:t>teammate1</w:t>
+              <w:t>董宇曦</w:t>
               <w:rPr>
                 <w:sz w:val="24"/>
               </w:rPr>
@@ -591,10 +591,10 @@
               </w:rPr>
             </w:pPr>
             <w:r>
-              <w:t>待填写</w:t>
-              <w:rPr>
-                <w:sz w:val="24"/>
-              </w:rPr>
+              <w:rPr>
+                <w:sz w:val="24"/>
+              </w:rPr>
+              <w:t>14230107</w:t>
             </w:r>
           </w:p>
         </w:tc>
@@ -612,7 +612,7 @@
               </w:rPr>
             </w:pPr>
             <w:r>
-              <w:t>teammate2</w:t>
+              <w:t>刘根森</w:t>
               <w:rPr>
                 <w:sz w:val="24"/>
               </w:rPr>
@@ -704,7 +704,7 @@
               </w:rPr>
             </w:pPr>
             <w:r>
-              <w:t>待填写</w:t>
+              <w:t>35231905</w:t>
               <w:rPr>
                 <w:sz w:val="24"/>
               </w:rPr>
@@ -725,7 +725,7 @@
               </w:rPr>
             </w:pPr>
             <w:r>
-              <w:t>teammate3</w:t>
+              <w:t>李怡宁</w:t>
               <w:rPr>
                 <w:sz w:val="24"/>
               </w:rPr>
@@ -817,7 +817,7 @@
               </w:rPr>
             </w:pPr>
             <w:r>
-              <w:t>待填写</w:t>
+              <w:t>27200221</w:t>
               <w:rPr>
                 <w:sz w:val="24"/>
               </w:rPr>
@@ -838,7 +838,7 @@
               </w:rPr>
             </w:pPr>
             <w:r>
-              <w:t>teammate4</w:t>
+              <w:t>赵毓豪</w:t>
               <w:rPr>
                 <w:sz w:val="24"/>
               </w:rPr>

</xml_diff>

<commit_message>
docs: set each team member contribution to 20 percent
</commit_message>
<xml_diff>
--- a/01-提交文档/00-提交封面.docx
+++ b/01-提交文档/00-提交封面.docx
@@ -407,10 +407,10 @@
               </w:rPr>
             </w:pPr>
             <w:r>
-              <w:t>待确认</w:t>
-              <w:rPr>
-                <w:sz w:val="24"/>
-              </w:rPr>
+              <w:rPr>
+                <w:sz w:val="24"/>
+              </w:rPr>
+              <w:t>20%</w:t>
             </w:r>
           </w:p>
         </w:tc>
@@ -520,10 +520,10 @@
               </w:rPr>
             </w:pPr>
             <w:r>
-              <w:t>待确认</w:t>
-              <w:rPr>
-                <w:sz w:val="24"/>
-              </w:rPr>
+              <w:rPr>
+                <w:sz w:val="24"/>
+              </w:rPr>
+              <w:t>20%</w:t>
             </w:r>
           </w:p>
         </w:tc>
@@ -633,10 +633,10 @@
               </w:rPr>
             </w:pPr>
             <w:r>
-              <w:t>待确认</w:t>
-              <w:rPr>
-                <w:sz w:val="24"/>
-              </w:rPr>
+              <w:rPr>
+                <w:sz w:val="24"/>
+              </w:rPr>
+              <w:t>20%</w:t>
             </w:r>
           </w:p>
         </w:tc>
@@ -746,10 +746,10 @@
               </w:rPr>
             </w:pPr>
             <w:r>
-              <w:t>待确认</w:t>
-              <w:rPr>
-                <w:sz w:val="24"/>
-              </w:rPr>
+              <w:rPr>
+                <w:sz w:val="24"/>
+              </w:rPr>
+              <w:t>20%</w:t>
             </w:r>
           </w:p>
         </w:tc>
@@ -859,10 +859,10 @@
               </w:rPr>
             </w:pPr>
             <w:r>
-              <w:t>待确认</w:t>
-              <w:rPr>
-                <w:sz w:val="24"/>
-              </w:rPr>
+              <w:rPr>
+                <w:sz w:val="24"/>
+              </w:rPr>
+              <w:t>20%</w:t>
             </w:r>
           </w:p>
         </w:tc>
@@ -909,6 +909,263 @@
           <w:szCs w:val="28"/>
         </w:rPr>
         <w:t>注：贡献百分比必填，手写/电子签名必填</w:t>
+      </w:r>
+    </w:p>
+    <w:p>
+      <w:pPr>
+        <w:pStyle w:val="Title"/>
+        <w:pageBreakBefore/>
+        <w:spacing w:before="360" w:after="640"/>
+        <w:jc w:val="center"/>
+      </w:pPr>
+      <w:r>
+        <w:rPr>
+          <w:rFonts w:ascii="宋体" w:hAnsi="宋体" w:eastAsia="宋体"/>
+          <w:b/>
+          <w:color w:val="000000"/>
+          <w:sz w:val="44"/>
+        </w:rPr>
+        <w:t>目录</w:t>
+      </w:r>
+    </w:p>
+    <w:p>
+      <w:pPr>
+        <w:tabs>
+          <w:tab w:pos="1417" w:val="left"/>
+        </w:tabs>
+        <w:spacing w:before="0" w:after="300" w:line="300" w:lineRule="auto"/>
+        <w:ind w:left="454" w:firstLine="0"/>
+      </w:pPr>
+      <w:r>
+        <w:rPr>
+          <w:rFonts w:ascii="宋体" w:hAnsi="宋体" w:eastAsia="宋体"/>
+          <w:b w:val="0"/>
+          <w:color w:val="000000"/>
+          <w:sz w:val="28"/>
+        </w:rPr>
+        <w:t>01</w:t>
+        <w:tab/>
+        <w:t>开发计划</w:t>
+      </w:r>
+    </w:p>
+    <w:p>
+      <w:pPr>
+        <w:tabs>
+          <w:tab w:pos="1417" w:val="left"/>
+        </w:tabs>
+        <w:spacing w:before="0" w:after="300" w:line="300" w:lineRule="auto"/>
+        <w:ind w:left="454" w:firstLine="0"/>
+      </w:pPr>
+      <w:r>
+        <w:rPr>
+          <w:rFonts w:ascii="宋体" w:hAnsi="宋体" w:eastAsia="宋体"/>
+          <w:b w:val="0"/>
+          <w:color w:val="000000"/>
+          <w:sz w:val="28"/>
+        </w:rPr>
+        <w:t>02</w:t>
+        <w:tab/>
+        <w:t>需求分析文档</w:t>
+      </w:r>
+    </w:p>
+    <w:p>
+      <w:pPr>
+        <w:tabs>
+          <w:tab w:pos="1417" w:val="left"/>
+        </w:tabs>
+        <w:spacing w:before="0" w:after="300" w:line="300" w:lineRule="auto"/>
+        <w:ind w:left="454" w:firstLine="0"/>
+      </w:pPr>
+      <w:r>
+        <w:rPr>
+          <w:rFonts w:ascii="宋体" w:hAnsi="宋体" w:eastAsia="宋体"/>
+          <w:b w:val="0"/>
+          <w:color w:val="000000"/>
+          <w:sz w:val="28"/>
+        </w:rPr>
+        <w:t>03</w:t>
+        <w:tab/>
+        <w:t>设计文档</w:t>
+      </w:r>
+    </w:p>
+    <w:p>
+      <w:pPr>
+        <w:tabs>
+          <w:tab w:pos="1417" w:val="left"/>
+        </w:tabs>
+        <w:spacing w:before="0" w:after="300" w:line="300" w:lineRule="auto"/>
+        <w:ind w:left="454" w:firstLine="0"/>
+      </w:pPr>
+      <w:r>
+        <w:rPr>
+          <w:rFonts w:ascii="宋体" w:hAnsi="宋体" w:eastAsia="宋体"/>
+          <w:b w:val="0"/>
+          <w:color w:val="000000"/>
+          <w:sz w:val="28"/>
+        </w:rPr>
+        <w:t>04</w:t>
+        <w:tab/>
+        <w:t>测试计划</w:t>
+      </w:r>
+    </w:p>
+    <w:p>
+      <w:pPr>
+        <w:tabs>
+          <w:tab w:pos="1417" w:val="left"/>
+        </w:tabs>
+        <w:spacing w:before="0" w:after="300" w:line="300" w:lineRule="auto"/>
+        <w:ind w:left="454" w:firstLine="0"/>
+      </w:pPr>
+      <w:r>
+        <w:rPr>
+          <w:rFonts w:ascii="宋体" w:hAnsi="宋体" w:eastAsia="宋体"/>
+          <w:b w:val="0"/>
+          <w:color w:val="000000"/>
+          <w:sz w:val="28"/>
+        </w:rPr>
+        <w:t>05</w:t>
+        <w:tab/>
+        <w:t>测试报告</w:t>
+      </w:r>
+    </w:p>
+    <w:p>
+      <w:pPr>
+        <w:tabs>
+          <w:tab w:pos="1417" w:val="left"/>
+        </w:tabs>
+        <w:spacing w:before="0" w:after="300" w:line="300" w:lineRule="auto"/>
+        <w:ind w:left="454" w:firstLine="0"/>
+      </w:pPr>
+      <w:r>
+        <w:rPr>
+          <w:rFonts w:ascii="宋体" w:hAnsi="宋体" w:eastAsia="宋体"/>
+          <w:b w:val="0"/>
+          <w:color w:val="000000"/>
+          <w:sz w:val="28"/>
+        </w:rPr>
+        <w:t>06</w:t>
+        <w:tab/>
+        <w:t>软件配置管理计划</w:t>
+      </w:r>
+    </w:p>
+    <w:p>
+      <w:pPr>
+        <w:tabs>
+          <w:tab w:pos="1417" w:val="left"/>
+        </w:tabs>
+        <w:spacing w:before="0" w:after="300" w:line="300" w:lineRule="auto"/>
+        <w:ind w:left="454" w:firstLine="0"/>
+      </w:pPr>
+      <w:r>
+        <w:rPr>
+          <w:rFonts w:ascii="宋体" w:hAnsi="宋体" w:eastAsia="宋体"/>
+          <w:b w:val="0"/>
+          <w:color w:val="000000"/>
+          <w:sz w:val="28"/>
+        </w:rPr>
+        <w:t>07</w:t>
+        <w:tab/>
+        <w:t>小组工作总结</w:t>
+      </w:r>
+    </w:p>
+    <w:p>
+      <w:pPr>
+        <w:tabs>
+          <w:tab w:pos="1417" w:val="left"/>
+        </w:tabs>
+        <w:spacing w:before="0" w:after="300" w:line="300" w:lineRule="auto"/>
+        <w:ind w:left="454" w:firstLine="0"/>
+      </w:pPr>
+      <w:r>
+        <w:rPr>
+          <w:rFonts w:ascii="宋体" w:hAnsi="宋体" w:eastAsia="宋体"/>
+          <w:b w:val="0"/>
+          <w:color w:val="000000"/>
+          <w:sz w:val="28"/>
+        </w:rPr>
+        <w:t>08-0</w:t>
+        <w:tab/>
+        <w:t>陈辰个人工作总结</w:t>
+      </w:r>
+    </w:p>
+    <w:p>
+      <w:pPr>
+        <w:tabs>
+          <w:tab w:pos="1417" w:val="left"/>
+        </w:tabs>
+        <w:spacing w:before="0" w:after="300" w:line="300" w:lineRule="auto"/>
+        <w:ind w:left="454" w:firstLine="0"/>
+      </w:pPr>
+      <w:r>
+        <w:rPr>
+          <w:rFonts w:ascii="宋体" w:hAnsi="宋体" w:eastAsia="宋体"/>
+          <w:b w:val="0"/>
+          <w:color w:val="000000"/>
+          <w:sz w:val="28"/>
+        </w:rPr>
+        <w:t>08-1</w:t>
+        <w:tab/>
+        <w:t>董宇曦个人工作总结</w:t>
+      </w:r>
+    </w:p>
+    <w:p>
+      <w:pPr>
+        <w:tabs>
+          <w:tab w:pos="1417" w:val="left"/>
+        </w:tabs>
+        <w:spacing w:before="0" w:after="300" w:line="300" w:lineRule="auto"/>
+        <w:ind w:left="454" w:firstLine="0"/>
+      </w:pPr>
+      <w:r>
+        <w:rPr>
+          <w:rFonts w:ascii="宋体" w:hAnsi="宋体" w:eastAsia="宋体"/>
+          <w:b w:val="0"/>
+          <w:color w:val="000000"/>
+          <w:sz w:val="28"/>
+        </w:rPr>
+        <w:t>08-2</w:t>
+        <w:tab/>
+        <w:t>刘根森个人工作总结</w:t>
+      </w:r>
+    </w:p>
+    <w:p>
+      <w:pPr>
+        <w:tabs>
+          <w:tab w:pos="1417" w:val="left"/>
+        </w:tabs>
+        <w:spacing w:before="0" w:after="300" w:line="300" w:lineRule="auto"/>
+        <w:ind w:left="454" w:firstLine="0"/>
+      </w:pPr>
+      <w:r>
+        <w:rPr>
+          <w:rFonts w:ascii="宋体" w:hAnsi="宋体" w:eastAsia="宋体"/>
+          <w:b w:val="0"/>
+          <w:color w:val="000000"/>
+          <w:sz w:val="28"/>
+        </w:rPr>
+        <w:t>08-3</w:t>
+        <w:tab/>
+        <w:t>李怡宁个人工作总结</w:t>
+      </w:r>
+    </w:p>
+    <w:p>
+      <w:pPr>
+        <w:tabs>
+          <w:tab w:pos="1417" w:val="left"/>
+        </w:tabs>
+        <w:spacing w:before="0" w:after="300" w:line="300" w:lineRule="auto"/>
+        <w:ind w:left="454" w:firstLine="0"/>
+      </w:pPr>
+      <w:r>
+        <w:rPr>
+          <w:rFonts w:ascii="宋体" w:hAnsi="宋体" w:eastAsia="宋体"/>
+          <w:b w:val="0"/>
+          <w:color w:val="000000"/>
+          <w:sz w:val="28"/>
+        </w:rPr>
+        <w:t>08-4</w:t>
+        <w:tab/>
+        <w:t>赵毓豪个人工作总结</w:t>
       </w:r>
     </w:p>
     <w:sectPr>
@@ -1361,6 +1618,10 @@
       <w:szCs w:val="18"/>
     </w:rPr>
   </w:style>
+  <w:style w:type="paragraph" w:customStyle="1" w:styleId="Title">
+    <w:name w:val="Title"/>
+    <w:basedOn w:val="1"/>
+  </w:style>
 </w:styles>
 </file>
 

</xml_diff>